<commit_message>
Correct terminology and gap count across project docs
Rename to Gap Assessment terminology, correct artifact count (12, not 13), and update gap count to 66 across all project documents
</commit_message>
<xml_diff>
--- a/case-studies/custody-corp/Custody_Corp_Executive_Summary.docx
+++ b/case-studies/custody-corp/Custody_Corp_Executive_Summary.docx
@@ -47,7 +47,7 @@
           <w:sz w:val="24"/>
           <w:szCs w:val="24"/>
         </w:rPr>
-        <w:t xml:space="preserve">Custody Corp — Information Security Readiness Assessment</w:t>
+        <w:t xml:space="preserve">Custody Corp — Information Security Gap Assessment</w:t>
       </w:r>
     </w:p>
     <w:tbl>
@@ -112,7 +112,7 @@
                 <w:sz w:val="20"/>
                 <w:szCs w:val="20"/>
               </w:rPr>
-              <w:t xml:space="preserve">Executive Summary — Custody Corp Readiness Assessment</w:t>
+              <w:t xml:space="preserve">Executive Summary — Custody Corp Gap Assessment</w:t>
             </w:r>
           </w:p>
         </w:tc>
@@ -265,7 +265,7 @@
                 <w:sz w:val="20"/>
                 <w:szCs w:val="20"/>
               </w:rPr>
-              <w:t xml:space="preserve">Non-technical summary of findings and recommended next steps, closing the Readiness Assessment engagement (SMCTR Framework, artifacts 1–7 of 13)</w:t>
+              <w:t xml:space="preserve">Non-technical summary of findings and recommended next steps, closing the Gap Assessment engagement (SMCTR Framework, artifacts 1–7 of 12)</w:t>
             </w:r>
           </w:p>
         </w:tc>
@@ -469,7 +469,7 @@
                 <w:sz w:val="34"/>
                 <w:szCs w:val="34"/>
               </w:rPr>
-              <w:t xml:space="preserve">65</w:t>
+              <w:t>66</w:t>
             </w:r>
           </w:p>
           <w:p>
@@ -703,7 +703,7 @@
           <w:sz w:val="23"/>
           <w:szCs w:val="23"/>
         </w:rPr>
-        <w:t xml:space="preserve">Of 65 improvement items identified, 17 carry meaningfully higher exposure than the rest. Given your current team — one IT Manager and yourself, without a dedicated security budget — tackling all 17 at once isn't realistic. The seven below are the ones we recommend prioritizing: six of the highest-exposure items, plus a formal security policy, which is inexpensive to produce and makes everything else easier to communicate and enforce.</w:t>
+        <w:t>Of 66 improvement items identified, 17 carry meaningfully higher exposure than the rest. Given your current team — one IT Manager and yourself, without a dedicated security budget — tackling all 17 at once isn't realistic. The seven below are the ones we recommend prioritizing: six of the highest-exposure items, plus a formal security policy, which is inexpensive to produce and makes everything else easier to communicate and enforce.</w:t>
       </w:r>
     </w:p>
     <w:tbl>
@@ -1506,7 +1506,7 @@
           <w:sz w:val="23"/>
           <w:szCs w:val="23"/>
         </w:rPr>
-        <w:t xml:space="preserve">The remaining 58 items — including 11 more in the higher-exposure category — are documented with an owner and a priority, ready for a second round once the first seven are underway. We'd recommend revisiting this list in roughly 90 days, once you can see how much of the first round is actually moving, before committing to what comes next.</w:t>
+        <w:t>The remaining 59 items — including 11 more in the higher-exposure category — are documented with an owner and a priority, ready for a second round once the first seven are underway. We'd recommend revisiting this list in roughly 90 days, once you can see how much of the first round is actually moving, before committing to what comes next.</w:t>
       </w:r>
     </w:p>
     <w:p>

</xml_diff>